<commit_message>
Updated approval report layout to support Purchae details.
</commit_message>
<xml_diff>
--- a/BryanA-DevelopmentsApp/Objects/ReportLayouts/ProdOrderApproval.docx
+++ b/BryanA-DevelopmentsApp/Objects/ReportLayouts/ProdOrderApproval.docx
@@ -1,6 +1,6 @@
 
 <file path=word/document.xml><?xml version="1.0" encoding="utf-8"?>
-<w:document xmlns:wpc="http://schemas.microsoft.com/office/word/2010/wordprocessingCanvas" xmlns:cx="http://schemas.microsoft.com/office/drawing/2014/chartex" xmlns:cx1="http://schemas.microsoft.com/office/drawing/2015/9/8/chartex" xmlns:cx2="http://schemas.microsoft.com/office/drawing/2015/10/21/chartex" xmlns:cx3="http://schemas.microsoft.com/office/drawing/2016/5/9/chartex" xmlns:cx4="http://schemas.microsoft.com/office/drawing/2016/5/10/chartex" xmlns:cx5="http://schemas.microsoft.com/office/drawing/2016/5/11/chartex" xmlns:cx6="http://schemas.microsoft.com/office/drawing/2016/5/12/chartex" xmlns:cx7="http://schemas.microsoft.com/office/drawing/2016/5/13/chartex" xmlns:cx8="http://schemas.microsoft.com/office/drawing/2016/5/14/chartex" xmlns:mc="http://schemas.openxmlformats.org/markup-compatibility/2006" xmlns:aink="http://schemas.microsoft.com/office/drawing/2016/ink" xmlns:am3d="http://schemas.microsoft.com/office/drawing/2017/model3d" xmlns:o="urn:schemas-microsoft-com:office:office" xmlns:oel="http://schemas.microsoft.com/office/2019/extlst" xmlns:r="http://schemas.openxmlformats.org/officeDocument/2006/relationships" xmlns:m="http://schemas.openxmlformats.org/officeDocument/2006/math" xmlns:v="urn:schemas-microsoft-com:vml" xmlns:wp14="http://schemas.microsoft.com/office/word/2010/wordprocessingDrawing" xmlns:wp="http://schemas.openxmlformats.org/drawingml/2006/wordprocessingDrawing" xmlns:w10="urn:schemas-microsoft-com:office:word" xmlns:w="http://schemas.openxmlformats.org/wordprocessingml/2006/main" xmlns:w14="http://schemas.microsoft.com/office/word/2010/wordml" xmlns:w15="http://schemas.microsoft.com/office/word/2012/wordml" xmlns:w16cex="http://schemas.microsoft.com/office/word/2018/wordml/cex" xmlns:w16cid="http://schemas.microsoft.com/office/word/2016/wordml/cid" xmlns:w16="http://schemas.microsoft.com/office/word/2018/wordml" xmlns:w16du="http://schemas.microsoft.com/office/word/2023/wordml/word16du" xmlns:w16sdtdh="http://schemas.microsoft.com/office/word/2020/wordml/sdtdatahash" xmlns:w16se="http://schemas.microsoft.com/office/word/2015/wordml/symex" xmlns:wpg="http://schemas.microsoft.com/office/word/2010/wordprocessingGroup" xmlns:wpi="http://schemas.microsoft.com/office/word/2010/wordprocessingInk" xmlns:wne="http://schemas.microsoft.com/office/word/2006/wordml" xmlns:wps="http://schemas.microsoft.com/office/word/2010/wordprocessingShape" mc:Ignorable="w14 w15 w16se w16cid w16 w16cex w16sdtdh w16du wp14">
+<w:document xmlns:wpc="http://schemas.microsoft.com/office/word/2010/wordprocessingCanvas" xmlns:cx="http://schemas.microsoft.com/office/drawing/2014/chartex" xmlns:cx1="http://schemas.microsoft.com/office/drawing/2015/9/8/chartex" xmlns:cx2="http://schemas.microsoft.com/office/drawing/2015/10/21/chartex" xmlns:cx3="http://schemas.microsoft.com/office/drawing/2016/5/9/chartex" xmlns:cx4="http://schemas.microsoft.com/office/drawing/2016/5/10/chartex" xmlns:cx5="http://schemas.microsoft.com/office/drawing/2016/5/11/chartex" xmlns:cx6="http://schemas.microsoft.com/office/drawing/2016/5/12/chartex" xmlns:cx7="http://schemas.microsoft.com/office/drawing/2016/5/13/chartex" xmlns:cx8="http://schemas.microsoft.com/office/drawing/2016/5/14/chartex" xmlns:mc="http://schemas.openxmlformats.org/markup-compatibility/2006" xmlns:aink="http://schemas.microsoft.com/office/drawing/2016/ink" xmlns:am3d="http://schemas.microsoft.com/office/drawing/2017/model3d" xmlns:o="urn:schemas-microsoft-com:office:office" xmlns:oel="http://schemas.microsoft.com/office/2019/extlst" xmlns:r="http://schemas.openxmlformats.org/officeDocument/2006/relationships" xmlns:m="http://schemas.openxmlformats.org/officeDocument/2006/math" xmlns:v="urn:schemas-microsoft-com:vml" xmlns:wp14="http://schemas.microsoft.com/office/word/2010/wordprocessingDrawing" xmlns:wp="http://schemas.openxmlformats.org/drawingml/2006/wordprocessingDrawing" xmlns:w10="urn:schemas-microsoft-com:office:word" xmlns:w="http://schemas.openxmlformats.org/wordprocessingml/2006/main" xmlns:w14="http://schemas.microsoft.com/office/word/2010/wordml" xmlns:w15="http://schemas.microsoft.com/office/word/2012/wordml" xmlns:w16cex="http://schemas.microsoft.com/office/word/2018/wordml/cex" xmlns:w16cid="http://schemas.microsoft.com/office/word/2016/wordml/cid" xmlns:w16="http://schemas.microsoft.com/office/word/2018/wordml" xmlns:w16du="http://schemas.microsoft.com/office/word/2023/wordml/word16du" xmlns:w16sdtdh="http://schemas.microsoft.com/office/word/2020/wordml/sdtdatahash" xmlns:w16sdtfl="http://schemas.microsoft.com/office/word/2024/wordml/sdtformatlock" xmlns:w16se="http://schemas.microsoft.com/office/word/2015/wordml/symex" xmlns:wpg="http://schemas.microsoft.com/office/word/2010/wordprocessingGroup" xmlns:wpi="http://schemas.microsoft.com/office/word/2010/wordprocessingInk" xmlns:wne="http://schemas.microsoft.com/office/word/2006/wordml" xmlns:wps="http://schemas.microsoft.com/office/word/2010/wordprocessingShape" mc:Ignorable="w14 w15 w16se w16cid w16 w16cex w16sdtdh w16sdtfl w16du wp14">
   <w:body>
     <w:p>
       <w:pPr>
@@ -35,7 +35,7 @@
           <w:placeholder>
             <w:docPart w:val="A576D4CC4ECA495D9959CF4F7BC8AA0A"/>
           </w:placeholder>
-          <w:dataBinding w:prefixMappings="xmlns:ns0='urn:microsoft-dynamics-nav/reports/BA Prod. Order Approval/50089/'" w:xpath="/ns0:NavWordReportXmlPart[1]/ns0:SalesHeader[1]/ns0:Username[1]" w:storeItemID="{B9963DF2-3DD4-401D-8284-D8B0C1A69617}"/>
+          <w:dataBinding w:prefixMappings="xmlns:ns0='urn:microsoft-dynamics-nav/reports/BA Prod. Order Approval/50089/'" w:xpath="/ns0:NavWordReportXmlPart[1]/ns0:SalesHeader[1]/ns0:Username[1]" w:storeItemID="{6EC095DC-DB5B-4B04-9780-E01BA8F3649F}"/>
           <w:text/>
         </w:sdtPr>
         <w:sdtContent>
@@ -80,7 +80,7 @@
           <w:placeholder>
             <w:docPart w:val="DefaultPlaceholder_-1854013440"/>
           </w:placeholder>
-          <w:dataBinding w:prefixMappings="xmlns:ns0='urn:microsoft-dynamics-nav/reports/BA Prod. Order Approval/50089/'" w:xpath="/ns0:NavWordReportXmlPart[1]/ns0:SalesHeader[1]/ns0:CompanyName[1]" w:storeItemID="{B9963DF2-3DD4-401D-8284-D8B0C1A69617}"/>
+          <w:dataBinding w:prefixMappings="xmlns:ns0='urn:microsoft-dynamics-nav/reports/BA Prod. Order Approval/50089/'" w:xpath="/ns0:NavWordReportXmlPart[1]/ns0:SalesHeader[1]/ns0:CompanyName[1]" w:storeItemID="{6EC095DC-DB5B-4B04-9780-E01BA8F3649F}"/>
           <w:text/>
         </w:sdtPr>
         <w:sdtContent>
@@ -148,6 +148,37 @@
                 <w:szCs w:val="20"/>
               </w:rPr>
             </w:pPr>
+            <w:sdt>
+              <w:sdtPr>
+                <w:rPr>
+                  <w:rFonts w:ascii="Calibri Light" w:hAnsi="Calibri Light" w:cs="Calibri Light"/>
+                  <w:color w:val="0070C0"/>
+                  <w:sz w:val="26"/>
+                  <w:szCs w:val="26"/>
+                </w:rPr>
+                <w:alias w:val="#Nav: /SalesHeader/DocType"/>
+                <w:tag w:val="#Nav: BA Prod. Order Approval/50089"/>
+                <w:id w:val="305209121"/>
+                <w:placeholder>
+                  <w:docPart w:val="DefaultPlaceholder_-1854013440"/>
+                </w:placeholder>
+                <w:dataBinding w:prefixMappings="xmlns:ns0='urn:microsoft-dynamics-nav/reports/BA Prod. Order Approval/50089/'" w:xpath="/ns0:NavWordReportXmlPart[1]/ns0:SalesHeader[1]/ns0:DocType[1]" w:storeItemID="{6EC095DC-DB5B-4B04-9780-E01BA8F3649F}"/>
+                <w:text/>
+              </w:sdtPr>
+              <w:sdtContent>
+                <w:proofErr w:type="spellStart"/>
+                <w:r>
+                  <w:rPr>
+                    <w:rFonts w:ascii="Calibri Light" w:hAnsi="Calibri Light" w:cs="Calibri Light"/>
+                    <w:color w:val="0070C0"/>
+                    <w:sz w:val="26"/>
+                    <w:szCs w:val="26"/>
+                  </w:rPr>
+                  <w:t>DocType</w:t>
+                </w:r>
+                <w:proofErr w:type="spellEnd"/>
+              </w:sdtContent>
+            </w:sdt>
             <w:r>
               <w:rPr>
                 <w:rFonts w:ascii="Calibri Light" w:hAnsi="Calibri Light" w:cs="Calibri Light"/>
@@ -155,7 +186,16 @@
                 <w:sz w:val="26"/>
                 <w:szCs w:val="26"/>
               </w:rPr>
-              <w:t xml:space="preserve">Sales Order </w:t>
+              <w:t xml:space="preserve"> </w:t>
+            </w:r>
+            <w:r>
+              <w:rPr>
+                <w:rFonts w:ascii="Calibri Light" w:hAnsi="Calibri Light" w:cs="Calibri Light"/>
+                <w:color w:val="0070C0"/>
+                <w:sz w:val="26"/>
+                <w:szCs w:val="26"/>
+              </w:rPr>
+              <w:t xml:space="preserve">Order </w:t>
             </w:r>
             <w:sdt>
               <w:sdtPr>
@@ -171,7 +211,7 @@
                 <w:placeholder>
                   <w:docPart w:val="9325301B213E4F2E91E5780082E12BB4"/>
                 </w:placeholder>
-                <w:dataBinding w:prefixMappings="xmlns:ns0='urn:microsoft-dynamics-nav/reports/BA Prod. Order Approval/50089/'" w:xpath="/ns0:NavWordReportXmlPart[1]/ns0:SalesHeader[1]/ns0:No[1]" w:storeItemID="{B9963DF2-3DD4-401D-8284-D8B0C1A69617}"/>
+                <w:dataBinding w:prefixMappings="xmlns:ns0='urn:microsoft-dynamics-nav/reports/BA Prod. Order Approval/50089/'" w:xpath="/ns0:NavWordReportXmlPart[1]/ns0:SalesHeader[1]/ns0:No[1]" w:storeItemID="{6EC095DC-DB5B-4B04-9780-E01BA8F3649F}"/>
                 <w:text/>
               </w:sdtPr>
               <w:sdtContent>
@@ -209,7 +249,7 @@
                 <w:placeholder>
                   <w:docPart w:val="9325301B213E4F2E91E5780082E12BB4"/>
                 </w:placeholder>
-                <w:dataBinding w:prefixMappings="xmlns:ns0='urn:microsoft-dynamics-nav/reports/BA Prod. Order Approval/50089/'" w:xpath="/ns0:NavWordReportXmlPart[1]/ns0:SalesHeader[1]/ns0:ApprovalAction[1]" w:storeItemID="{B9963DF2-3DD4-401D-8284-D8B0C1A69617}"/>
+                <w:dataBinding w:prefixMappings="xmlns:ns0='urn:microsoft-dynamics-nav/reports/BA Prod. Order Approval/50089/'" w:xpath="/ns0:NavWordReportXmlPart[1]/ns0:SalesHeader[1]/ns0:ApprovalAction[1]" w:storeItemID="{6EC095DC-DB5B-4B04-9780-E01BA8F3649F}"/>
                 <w:text/>
               </w:sdtPr>
               <w:sdtContent>
@@ -246,7 +286,7 @@
             <w:placeholder>
               <w:docPart w:val="DefaultPlaceholder_-1854013440"/>
             </w:placeholder>
-            <w:dataBinding w:prefixMappings="xmlns:ns0='urn:microsoft-dynamics-nav/reports/BA Prod. Order Approval/50089/'" w:xpath="/ns0:NavWordReportXmlPart[1]/ns0:SalesHeader[1]/ns0:AmountText[1]" w:storeItemID="{B9963DF2-3DD4-401D-8284-D8B0C1A69617}"/>
+            <w:dataBinding w:prefixMappings="xmlns:ns0='urn:microsoft-dynamics-nav/reports/BA Prod. Order Approval/50089/'" w:xpath="/ns0:NavWordReportXmlPart[1]/ns0:SalesHeader[1]/ns0:AmountText[1]" w:storeItemID="{6EC095DC-DB5B-4B04-9780-E01BA8F3649F}"/>
             <w:text/>
           </w:sdtPr>
           <w:sdtContent>
@@ -315,13 +355,42 @@
                 <w:szCs w:val="20"/>
               </w:rPr>
             </w:pPr>
+            <w:sdt>
+              <w:sdtPr>
+                <w:rPr>
+                  <w:rFonts w:ascii="Segoe UI" w:hAnsi="Segoe UI" w:cs="Segoe UI"/>
+                  <w:sz w:val="20"/>
+                  <w:szCs w:val="20"/>
+                </w:rPr>
+                <w:id w:val="-1267845734"/>
+                <w:placeholder>
+                  <w:docPart w:val="DefaultPlaceholder_-1854013440"/>
+                </w:placeholder>
+                <w:dataBinding w:prefixMappings="xmlns:ns0='urn:microsoft-dynamics-nav/reports/BA Prod. Order Approval/50089/'" w:xpath="/ns0:NavWordReportXmlPart[1]/ns0:SalesHeader[1]/ns0:SourceType[1]" w:storeItemID="{6EC095DC-DB5B-4B04-9780-E01BA8F3649F}"/>
+                <w:text/>
+                <w:alias w:val="#Nav: /SalesHeader/SourceType"/>
+                <w:tag w:val="#Nav: BA Prod. Order Approval/50089"/>
+              </w:sdtPr>
+              <w:sdtContent>
+                <w:proofErr w:type="spellStart"/>
+                <w:r>
+                  <w:rPr>
+                    <w:rFonts w:ascii="Segoe UI" w:hAnsi="Segoe UI" w:cs="Segoe UI"/>
+                    <w:sz w:val="20"/>
+                    <w:szCs w:val="20"/>
+                  </w:rPr>
+                  <w:t>SourceType</w:t>
+                </w:r>
+                <w:proofErr w:type="spellEnd"/>
+              </w:sdtContent>
+            </w:sdt>
             <w:r>
               <w:rPr>
                 <w:rFonts w:ascii="Segoe UI" w:hAnsi="Segoe UI" w:cs="Segoe UI"/>
                 <w:sz w:val="20"/>
                 <w:szCs w:val="20"/>
               </w:rPr>
-              <w:t xml:space="preserve">Customer: </w:t>
+              <w:t xml:space="preserve">: </w:t>
             </w:r>
             <w:sdt>
               <w:sdtPr>
@@ -336,7 +405,7 @@
                 <w:placeholder>
                   <w:docPart w:val="EA249C57D5734A398C5BF9EDBB8ADA2D"/>
                 </w:placeholder>
-                <w:dataBinding w:prefixMappings="xmlns:ns0='urn:microsoft-dynamics-nav/reports/BA Prod. Order Approval/50089/'" w:xpath="/ns0:NavWordReportXmlPart[1]/ns0:SalesHeader[1]/ns0:CustomerName[1]" w:storeItemID="{B9963DF2-3DD4-401D-8284-D8B0C1A69617}"/>
+                <w:dataBinding w:prefixMappings="xmlns:ns0='urn:microsoft-dynamics-nav/reports/BA Prod. Order Approval/50089/'" w:xpath="/ns0:NavWordReportXmlPart[1]/ns0:SalesHeader[1]/ns0:CustomerName[1]" w:storeItemID="{6EC095DC-DB5B-4B04-9780-E01BA8F3649F}"/>
                 <w:text/>
               </w:sdtPr>
               <w:sdtContent>
@@ -374,7 +443,7 @@
                 <w:placeholder>
                   <w:docPart w:val="EA249C57D5734A398C5BF9EDBB8ADA2D"/>
                 </w:placeholder>
-                <w:dataBinding w:prefixMappings="xmlns:ns0='urn:microsoft-dynamics-nav/reports/BA Prod. Order Approval/50089/'" w:xpath="/ns0:NavWordReportXmlPart[1]/ns0:SalesHeader[1]/ns0:CustomerNo[1]" w:storeItemID="{B9963DF2-3DD4-401D-8284-D8B0C1A69617}"/>
+                <w:dataBinding w:prefixMappings="xmlns:ns0='urn:microsoft-dynamics-nav/reports/BA Prod. Order Approval/50089/'" w:xpath="/ns0:NavWordReportXmlPart[1]/ns0:SalesHeader[1]/ns0:CustomerNo[1]" w:storeItemID="{6EC095DC-DB5B-4B04-9780-E01BA8F3649F}"/>
                 <w:text/>
               </w:sdtPr>
               <w:sdtContent>
@@ -419,7 +488,7 @@
               <w:placeholder>
                 <w:docPart w:val="0933EDDE22A6480F94AF5BE53E88EDA2"/>
               </w:placeholder>
-              <w:dataBinding w:prefixMappings="xmlns:ns0='urn:microsoft-dynamics-nav/reports/BA Prod. Order Approval/50089/'" w:xpath="/ns0:NavWordReportXmlPart[1]/ns0:SalesHeader[1]/ns0:OrderLink_Url[1]" w:storeItemID="{B9963DF2-3DD4-401D-8284-D8B0C1A69617}"/>
+              <w:dataBinding w:prefixMappings="xmlns:ns0='urn:microsoft-dynamics-nav/reports/BA Prod. Order Approval/50089/'" w:xpath="/ns0:NavWordReportXmlPart[1]/ns0:SalesHeader[1]/ns0:OrderLink_Url[1]" w:storeItemID="{6EC095DC-DB5B-4B04-9780-E01BA8F3649F}"/>
               <w:text/>
             </w:sdtPr>
             <w:sdtContent>
@@ -473,7 +542,7 @@
               <w:placeholder>
                 <w:docPart w:val="DE6BC01E14DB443282AA322B8A5F4EEF"/>
               </w:placeholder>
-              <w:dataBinding w:prefixMappings="xmlns:ns0='urn:microsoft-dynamics-nav/reports/BA Prod. Order Approval/50089/'" w:xpath="/ns0:NavWordReportXmlPart[1]/ns0:SalesHeader[1]/ns0:RejectReason[1]" w:storeItemID="{B9963DF2-3DD4-401D-8284-D8B0C1A69617}"/>
+              <w:dataBinding w:prefixMappings="xmlns:ns0='urn:microsoft-dynamics-nav/reports/BA Prod. Order Approval/50089/'" w:xpath="/ns0:NavWordReportXmlPart[1]/ns0:SalesHeader[1]/ns0:RejectReason[1]" w:storeItemID="{6EC095DC-DB5B-4B04-9780-E01BA8F3649F}"/>
               <w:text/>
             </w:sdtPr>
             <w:sdtContent>
@@ -539,7 +608,7 @@
 </file>
 
 <file path=word/styles.xml><?xml version="1.0" encoding="utf-8"?>
-<w:styles xmlns:mc="http://schemas.openxmlformats.org/markup-compatibility/2006" xmlns:r="http://schemas.openxmlformats.org/officeDocument/2006/relationships" xmlns:w="http://schemas.openxmlformats.org/wordprocessingml/2006/main" xmlns:w14="http://schemas.microsoft.com/office/word/2010/wordml" xmlns:w15="http://schemas.microsoft.com/office/word/2012/wordml" xmlns:w16cex="http://schemas.microsoft.com/office/word/2018/wordml/cex" xmlns:w16cid="http://schemas.microsoft.com/office/word/2016/wordml/cid" xmlns:w16="http://schemas.microsoft.com/office/word/2018/wordml" xmlns:w16du="http://schemas.microsoft.com/office/word/2023/wordml/word16du" xmlns:w16sdtdh="http://schemas.microsoft.com/office/word/2020/wordml/sdtdatahash" xmlns:w16se="http://schemas.microsoft.com/office/word/2015/wordml/symex" mc:Ignorable="w14 w15 w16se w16cid w16 w16cex w16sdtdh w16du">
+<w:styles xmlns:mc="http://schemas.openxmlformats.org/markup-compatibility/2006" xmlns:r="http://schemas.openxmlformats.org/officeDocument/2006/relationships" xmlns:w="http://schemas.openxmlformats.org/wordprocessingml/2006/main" xmlns:w14="http://schemas.microsoft.com/office/word/2010/wordml" xmlns:w15="http://schemas.microsoft.com/office/word/2012/wordml" xmlns:w16cex="http://schemas.microsoft.com/office/word/2018/wordml/cex" xmlns:w16cid="http://schemas.microsoft.com/office/word/2016/wordml/cid" xmlns:w16="http://schemas.microsoft.com/office/word/2018/wordml" xmlns:w16du="http://schemas.microsoft.com/office/word/2023/wordml/word16du" xmlns:w16sdtdh="http://schemas.microsoft.com/office/word/2020/wordml/sdtdatahash" xmlns:w16sdtfl="http://schemas.microsoft.com/office/word/2024/wordml/sdtformatlock" xmlns:w16se="http://schemas.microsoft.com/office/word/2015/wordml/symex" mc:Ignorable="w14 w15 w16se w16cid w16 w16cex w16sdtdh w16sdtfl w16du">
   <w:docDefaults>
     <w:rPrDefault>
       <w:rPr>
@@ -1012,7 +1081,7 @@
 </file>
 
 <file path=word/glossary/document.xml><?xml version="1.0" encoding="utf-8"?>
-<w:glossaryDocument xmlns:wpc="http://schemas.microsoft.com/office/word/2010/wordprocessingCanvas" xmlns:cx="http://schemas.microsoft.com/office/drawing/2014/chartex" xmlns:cx1="http://schemas.microsoft.com/office/drawing/2015/9/8/chartex" xmlns:cx2="http://schemas.microsoft.com/office/drawing/2015/10/21/chartex" xmlns:cx3="http://schemas.microsoft.com/office/drawing/2016/5/9/chartex" xmlns:cx4="http://schemas.microsoft.com/office/drawing/2016/5/10/chartex" xmlns:cx5="http://schemas.microsoft.com/office/drawing/2016/5/11/chartex" xmlns:cx6="http://schemas.microsoft.com/office/drawing/2016/5/12/chartex" xmlns:cx7="http://schemas.microsoft.com/office/drawing/2016/5/13/chartex" xmlns:cx8="http://schemas.microsoft.com/office/drawing/2016/5/14/chartex" xmlns:mc="http://schemas.openxmlformats.org/markup-compatibility/2006" xmlns:aink="http://schemas.microsoft.com/office/drawing/2016/ink" xmlns:am3d="http://schemas.microsoft.com/office/drawing/2017/model3d" xmlns:o="urn:schemas-microsoft-com:office:office" xmlns:oel="http://schemas.microsoft.com/office/2019/extlst" xmlns:r="http://schemas.openxmlformats.org/officeDocument/2006/relationships" xmlns:m="http://schemas.openxmlformats.org/officeDocument/2006/math" xmlns:v="urn:schemas-microsoft-com:vml" xmlns:wp14="http://schemas.microsoft.com/office/word/2010/wordprocessingDrawing" xmlns:wp="http://schemas.openxmlformats.org/drawingml/2006/wordprocessingDrawing" xmlns:w10="urn:schemas-microsoft-com:office:word" xmlns:w="http://schemas.openxmlformats.org/wordprocessingml/2006/main" xmlns:w14="http://schemas.microsoft.com/office/word/2010/wordml" xmlns:w15="http://schemas.microsoft.com/office/word/2012/wordml" xmlns:w16cex="http://schemas.microsoft.com/office/word/2018/wordml/cex" xmlns:w16cid="http://schemas.microsoft.com/office/word/2016/wordml/cid" xmlns:w16="http://schemas.microsoft.com/office/word/2018/wordml" xmlns:w16du="http://schemas.microsoft.com/office/word/2023/wordml/word16du" xmlns:w16sdtdh="http://schemas.microsoft.com/office/word/2020/wordml/sdtdatahash" xmlns:w16se="http://schemas.microsoft.com/office/word/2015/wordml/symex" xmlns:wpg="http://schemas.microsoft.com/office/word/2010/wordprocessingGroup" xmlns:wpi="http://schemas.microsoft.com/office/word/2010/wordprocessingInk" xmlns:wne="http://schemas.microsoft.com/office/word/2006/wordml" xmlns:wps="http://schemas.microsoft.com/office/word/2010/wordprocessingShape" mc:Ignorable="w14 w15 w16se w16cid w16 w16cex w16sdtdh w16du wp14">
+<w:glossaryDocument xmlns:wpc="http://schemas.microsoft.com/office/word/2010/wordprocessingCanvas" xmlns:cx="http://schemas.microsoft.com/office/drawing/2014/chartex" xmlns:cx1="http://schemas.microsoft.com/office/drawing/2015/9/8/chartex" xmlns:cx2="http://schemas.microsoft.com/office/drawing/2015/10/21/chartex" xmlns:cx3="http://schemas.microsoft.com/office/drawing/2016/5/9/chartex" xmlns:cx4="http://schemas.microsoft.com/office/drawing/2016/5/10/chartex" xmlns:cx5="http://schemas.microsoft.com/office/drawing/2016/5/11/chartex" xmlns:cx6="http://schemas.microsoft.com/office/drawing/2016/5/12/chartex" xmlns:cx7="http://schemas.microsoft.com/office/drawing/2016/5/13/chartex" xmlns:cx8="http://schemas.microsoft.com/office/drawing/2016/5/14/chartex" xmlns:mc="http://schemas.openxmlformats.org/markup-compatibility/2006" xmlns:aink="http://schemas.microsoft.com/office/drawing/2016/ink" xmlns:am3d="http://schemas.microsoft.com/office/drawing/2017/model3d" xmlns:o="urn:schemas-microsoft-com:office:office" xmlns:oel="http://schemas.microsoft.com/office/2019/extlst" xmlns:r="http://schemas.openxmlformats.org/officeDocument/2006/relationships" xmlns:m="http://schemas.openxmlformats.org/officeDocument/2006/math" xmlns:v="urn:schemas-microsoft-com:vml" xmlns:wp14="http://schemas.microsoft.com/office/word/2010/wordprocessingDrawing" xmlns:wp="http://schemas.openxmlformats.org/drawingml/2006/wordprocessingDrawing" xmlns:w10="urn:schemas-microsoft-com:office:word" xmlns:w="http://schemas.openxmlformats.org/wordprocessingml/2006/main" xmlns:w14="http://schemas.microsoft.com/office/word/2010/wordml" xmlns:w15="http://schemas.microsoft.com/office/word/2012/wordml" xmlns:w16cex="http://schemas.microsoft.com/office/word/2018/wordml/cex" xmlns:w16cid="http://schemas.microsoft.com/office/word/2016/wordml/cid" xmlns:w16="http://schemas.microsoft.com/office/word/2018/wordml" xmlns:w16du="http://schemas.microsoft.com/office/word/2023/wordml/word16du" xmlns:w16sdtdh="http://schemas.microsoft.com/office/word/2020/wordml/sdtdatahash" xmlns:w16sdtfl="http://schemas.microsoft.com/office/word/2024/wordml/sdtformatlock" xmlns:w16se="http://schemas.microsoft.com/office/word/2015/wordml/symex" xmlns:wpg="http://schemas.microsoft.com/office/word/2010/wordprocessingGroup" xmlns:wpi="http://schemas.microsoft.com/office/word/2010/wordprocessingInk" xmlns:wne="http://schemas.microsoft.com/office/word/2006/wordml" xmlns:wps="http://schemas.microsoft.com/office/word/2010/wordprocessingShape" mc:Ignorable="w14 w15 w16se w16cid w16 w16cex w16sdtdh w16sdtfl w16du wp14">
   <w:docParts>
     <w:docPart>
       <w:docPartPr>
@@ -1190,7 +1259,7 @@
 </file>
 
 <file path=word/glossary/fontTable.xml><?xml version="1.0" encoding="utf-8"?>
-<w:fonts xmlns:mc="http://schemas.openxmlformats.org/markup-compatibility/2006" xmlns:r="http://schemas.openxmlformats.org/officeDocument/2006/relationships" xmlns:w="http://schemas.openxmlformats.org/wordprocessingml/2006/main" xmlns:w14="http://schemas.microsoft.com/office/word/2010/wordml" xmlns:w15="http://schemas.microsoft.com/office/word/2012/wordml" xmlns:w16cex="http://schemas.microsoft.com/office/word/2018/wordml/cex" xmlns:w16cid="http://schemas.microsoft.com/office/word/2016/wordml/cid" xmlns:w16="http://schemas.microsoft.com/office/word/2018/wordml" xmlns:w16du="http://schemas.microsoft.com/office/word/2023/wordml/word16du" xmlns:w16sdtdh="http://schemas.microsoft.com/office/word/2020/wordml/sdtdatahash" xmlns:w16se="http://schemas.microsoft.com/office/word/2015/wordml/symex" mc:Ignorable="w14 w15 w16se w16cid w16 w16cex w16sdtdh w16du">
+<w:fonts xmlns:mc="http://schemas.openxmlformats.org/markup-compatibility/2006" xmlns:r="http://schemas.openxmlformats.org/officeDocument/2006/relationships" xmlns:w="http://schemas.openxmlformats.org/wordprocessingml/2006/main" xmlns:w14="http://schemas.microsoft.com/office/word/2010/wordml" xmlns:w15="http://schemas.microsoft.com/office/word/2012/wordml" xmlns:w16cex="http://schemas.microsoft.com/office/word/2018/wordml/cex" xmlns:w16cid="http://schemas.microsoft.com/office/word/2016/wordml/cid" xmlns:w16="http://schemas.microsoft.com/office/word/2018/wordml" xmlns:w16du="http://schemas.microsoft.com/office/word/2023/wordml/word16du" xmlns:w16sdtdh="http://schemas.microsoft.com/office/word/2020/wordml/sdtdatahash" xmlns:w16sdtfl="http://schemas.microsoft.com/office/word/2024/wordml/sdtformatlock" xmlns:w16se="http://schemas.microsoft.com/office/word/2015/wordml/symex" mc:Ignorable="w14 w15 w16se w16cid w16 w16cex w16sdtdh w16sdtfl w16du">
   <w:font w:name="Aptos">
     <w:altName w:val="Calibri"/>
     <w:panose1 w:val="00000000000000000000"/>
@@ -1218,7 +1287,7 @@
     <w:charset w:val="00"/>
     <w:family w:val="swiss"/>
     <w:pitch w:val="variable"/>
-    <w:sig w:usb0="E0002AFF" w:usb1="C000247B" w:usb2="00000009" w:usb3="00000000" w:csb0="000001FF" w:csb1="00000000"/>
+    <w:sig w:usb0="E4002EFF" w:usb1="C200247B" w:usb2="00000009" w:usb3="00000000" w:csb0="000001FF" w:csb1="00000000"/>
   </w:font>
   <w:font w:name="Aptos Display">
     <w:altName w:val="Calibri"/>
@@ -1232,7 +1301,7 @@
 </file>
 
 <file path=word/glossary/settings.xml><?xml version="1.0" encoding="utf-8"?>
-<w:settings xmlns:mc="http://schemas.openxmlformats.org/markup-compatibility/2006" xmlns:o="urn:schemas-microsoft-com:office:office" xmlns:r="http://schemas.openxmlformats.org/officeDocument/2006/relationships" xmlns:m="http://schemas.openxmlformats.org/officeDocument/2006/math" xmlns:v="urn:schemas-microsoft-com:vml" xmlns:w10="urn:schemas-microsoft-com:office:word" xmlns:w="http://schemas.openxmlformats.org/wordprocessingml/2006/main" xmlns:w14="http://schemas.microsoft.com/office/word/2010/wordml" xmlns:w15="http://schemas.microsoft.com/office/word/2012/wordml" xmlns:w16cex="http://schemas.microsoft.com/office/word/2018/wordml/cex" xmlns:w16cid="http://schemas.microsoft.com/office/word/2016/wordml/cid" xmlns:w16="http://schemas.microsoft.com/office/word/2018/wordml" xmlns:w16du="http://schemas.microsoft.com/office/word/2023/wordml/word16du" xmlns:w16sdtdh="http://schemas.microsoft.com/office/word/2020/wordml/sdtdatahash" xmlns:w16se="http://schemas.microsoft.com/office/word/2015/wordml/symex" xmlns:sl="http://schemas.openxmlformats.org/schemaLibrary/2006/main" mc:Ignorable="w14 w15 w16se w16cid w16 w16cex w16sdtdh w16du">
+<w:settings xmlns:mc="http://schemas.openxmlformats.org/markup-compatibility/2006" xmlns:o="urn:schemas-microsoft-com:office:office" xmlns:r="http://schemas.openxmlformats.org/officeDocument/2006/relationships" xmlns:m="http://schemas.openxmlformats.org/officeDocument/2006/math" xmlns:v="urn:schemas-microsoft-com:vml" xmlns:w10="urn:schemas-microsoft-com:office:word" xmlns:w="http://schemas.openxmlformats.org/wordprocessingml/2006/main" xmlns:w14="http://schemas.microsoft.com/office/word/2010/wordml" xmlns:w15="http://schemas.microsoft.com/office/word/2012/wordml" xmlns:w16cex="http://schemas.microsoft.com/office/word/2018/wordml/cex" xmlns:w16cid="http://schemas.microsoft.com/office/word/2016/wordml/cid" xmlns:w16="http://schemas.microsoft.com/office/word/2018/wordml" xmlns:w16du="http://schemas.microsoft.com/office/word/2023/wordml/word16du" xmlns:w16sdtdh="http://schemas.microsoft.com/office/word/2020/wordml/sdtdatahash" xmlns:w16sdtfl="http://schemas.microsoft.com/office/word/2024/wordml/sdtformatlock" xmlns:w16se="http://schemas.microsoft.com/office/word/2015/wordml/symex" xmlns:sl="http://schemas.openxmlformats.org/schemaLibrary/2006/main" mc:Ignorable="w14 w15 w16se w16cid w16 w16cex w16sdtdh w16sdtfl w16du">
   <w:view w:val="normal"/>
   <w:defaultTabStop w:val="720"/>
   <w:characterSpacingControl w:val="doNotCompress"/>
@@ -1255,6 +1324,7 @@
     <w:rsid w:val="001F72A8"/>
     <w:rsid w:val="002433CF"/>
     <w:rsid w:val="00366B88"/>
+    <w:rsid w:val="003C324F"/>
     <w:rsid w:val="003D4A0F"/>
     <w:rsid w:val="0040360E"/>
     <w:rsid w:val="00475A5F"/>
@@ -1268,12 +1338,14 @@
     <w:rsid w:val="006C5A3D"/>
     <w:rsid w:val="00790C7D"/>
     <w:rsid w:val="008621FF"/>
+    <w:rsid w:val="00894418"/>
     <w:rsid w:val="008B64C8"/>
     <w:rsid w:val="009072FD"/>
     <w:rsid w:val="009B415A"/>
     <w:rsid w:val="009D4870"/>
     <w:rsid w:val="00A15DD0"/>
     <w:rsid w:val="00B86D5B"/>
+    <w:rsid w:val="00BC04BF"/>
     <w:rsid w:val="00C033A8"/>
     <w:rsid w:val="00C160C7"/>
     <w:rsid w:val="00CB6CB7"/>
@@ -1284,6 +1356,7 @@
     <w:rsid w:val="00F6449C"/>
     <w:rsid w:val="00F80351"/>
     <w:rsid w:val="00FA48B4"/>
+    <w:rsid w:val="00FD48FB"/>
   </w:rsids>
   <m:mathPr>
     <m:mathFont m:val="Cambria Math"/>
@@ -1307,7 +1380,7 @@
 </file>
 
 <file path=word/glossary/styles.xml><?xml version="1.0" encoding="utf-8"?>
-<w:styles xmlns:mc="http://schemas.openxmlformats.org/markup-compatibility/2006" xmlns:r="http://schemas.openxmlformats.org/officeDocument/2006/relationships" xmlns:w="http://schemas.openxmlformats.org/wordprocessingml/2006/main" xmlns:w14="http://schemas.microsoft.com/office/word/2010/wordml" xmlns:w15="http://schemas.microsoft.com/office/word/2012/wordml" xmlns:w16cex="http://schemas.microsoft.com/office/word/2018/wordml/cex" xmlns:w16cid="http://schemas.microsoft.com/office/word/2016/wordml/cid" xmlns:w16="http://schemas.microsoft.com/office/word/2018/wordml" xmlns:w16du="http://schemas.microsoft.com/office/word/2023/wordml/word16du" xmlns:w16sdtdh="http://schemas.microsoft.com/office/word/2020/wordml/sdtdatahash" xmlns:w16se="http://schemas.microsoft.com/office/word/2015/wordml/symex" mc:Ignorable="w14 w15 w16se w16cid w16 w16cex w16sdtdh w16du">
+<w:styles xmlns:mc="http://schemas.openxmlformats.org/markup-compatibility/2006" xmlns:r="http://schemas.openxmlformats.org/officeDocument/2006/relationships" xmlns:w="http://schemas.openxmlformats.org/wordprocessingml/2006/main" xmlns:w14="http://schemas.microsoft.com/office/word/2010/wordml" xmlns:w15="http://schemas.microsoft.com/office/word/2012/wordml" xmlns:w16cex="http://schemas.microsoft.com/office/word/2018/wordml/cex" xmlns:w16cid="http://schemas.microsoft.com/office/word/2016/wordml/cid" xmlns:w16="http://schemas.microsoft.com/office/word/2018/wordml" xmlns:w16du="http://schemas.microsoft.com/office/word/2023/wordml/word16du" xmlns:w16sdtdh="http://schemas.microsoft.com/office/word/2020/wordml/sdtdatahash" xmlns:w16sdtfl="http://schemas.microsoft.com/office/word/2024/wordml/sdtformatlock" xmlns:w16se="http://schemas.microsoft.com/office/word/2015/wordml/symex" mc:Ignorable="w14 w15 w16se w16cid w16 w16cex w16sdtdh w16sdtfl w16du">
   <w:docDefaults>
     <w:rPrDefault>
       <w:rPr>
@@ -1768,7 +1841,7 @@
 </file>
 
 <file path=word/glossary/webSettings.xml><?xml version="1.0" encoding="utf-8"?>
-<w:webSettings xmlns:mc="http://schemas.openxmlformats.org/markup-compatibility/2006" xmlns:r="http://schemas.openxmlformats.org/officeDocument/2006/relationships" xmlns:w="http://schemas.openxmlformats.org/wordprocessingml/2006/main" xmlns:w14="http://schemas.microsoft.com/office/word/2010/wordml" xmlns:w15="http://schemas.microsoft.com/office/word/2012/wordml" xmlns:w16cex="http://schemas.microsoft.com/office/word/2018/wordml/cex" xmlns:w16cid="http://schemas.microsoft.com/office/word/2016/wordml/cid" xmlns:w16="http://schemas.microsoft.com/office/word/2018/wordml" xmlns:w16du="http://schemas.microsoft.com/office/word/2023/wordml/word16du" xmlns:w16sdtdh="http://schemas.microsoft.com/office/word/2020/wordml/sdtdatahash" xmlns:w16se="http://schemas.microsoft.com/office/word/2015/wordml/symex" mc:Ignorable="w14 w15 w16se w16cid w16 w16cex w16sdtdh w16du">
+<w:webSettings xmlns:mc="http://schemas.openxmlformats.org/markup-compatibility/2006" xmlns:r="http://schemas.openxmlformats.org/officeDocument/2006/relationships" xmlns:w="http://schemas.openxmlformats.org/wordprocessingml/2006/main" xmlns:w14="http://schemas.microsoft.com/office/word/2010/wordml" xmlns:w15="http://schemas.microsoft.com/office/word/2012/wordml" xmlns:w16cex="http://schemas.microsoft.com/office/word/2018/wordml/cex" xmlns:w16cid="http://schemas.microsoft.com/office/word/2016/wordml/cid" xmlns:w16="http://schemas.microsoft.com/office/word/2018/wordml" xmlns:w16du="http://schemas.microsoft.com/office/word/2023/wordml/word16du" xmlns:w16sdtdh="http://schemas.microsoft.com/office/word/2020/wordml/sdtdatahash" xmlns:w16sdtfl="http://schemas.microsoft.com/office/word/2024/wordml/sdtformatlock" xmlns:w16se="http://schemas.microsoft.com/office/word/2015/wordml/symex" mc:Ignorable="w14 w15 w16se w16cid w16 w16cex w16sdtdh w16sdtfl w16du">
   <w:optimizeForBrowser/>
   <w:allowPNG/>
 </w:webSettings>
@@ -2069,9 +2142,9 @@
 </a:theme>
 </file>
 
-<file path=customXML/item3.xml>��< ? x m l   v e r s i o n = " 1 . 0 "   e n c o d i n g = " u t f - 1 6 " ? > +<file path=customXml/item1.xml>��< ? x m l   v e r s i o n = " 1 . 0 "   e n c o d i n g = " u t f - 1 6 " ? > < N a v W o r d R e p o r t X m l P a r t   x m l n s = " u r n : m i c r o s o f t - d y n a m i c s - n a v / r e p o r t s / B A   P r o d .   O r d e r   A p p r o v a l / 5 0 0 8 9 / " >   
- < N a v W o r d R e p o r t X m l P a r t   x m l n s = " u r n : m i c r o s o f t - d y n a m i c s - n a v / r e p o r t s / B A   P r o d .   O r d e r   A p p r o v a l / 5 0 0 8 9 / " > +     < P u r c h a s e H e a d e r / >   
      < S a l e s H e a d e r >   
@@ -2085,6 +2158,8 @@
  
          < C u s t o m e r N o > C u s t o m e r N o < / C u s t o m e r N o >   
+         < D o c T y p e > D o c T y p e < / D o c T y p e > + 
          < N o > N o < / N o >   
          < O r d e r L i n k _ U r l > O r d e r L i n k _ U r l < / O r d e r L i n k _ U r l > @@ -2093,9 +2168,19 @@
  
          < R e j e c t R e a s o n > R e j e c t R e a s o n < / R e j e c t R e a s o n >   
+         < S o u r c e T y p e > S o u r c e T y p e < / S o u r c e T y p e > + 
          < U s e r n a m e > U s e r n a m e < / U s e r n a m e >   
      < / S a l e s H e a d e r >   
  < / N a v W o r d R e p o r t X m l P a r t > 
+</file>
+
+<file path=customXml/itemProps1.xml><?xml version="1.0" encoding="utf-8"?>
+<ds:datastoreItem xmlns:ds="http://schemas.openxmlformats.org/officeDocument/2006/customXml" ds:itemID="{6EC095DC-DB5B-4B04-9780-E01BA8F3649F}">
+  <ds:schemaRefs>
+    <ds:schemaRef ds:uri="urn:microsoft-dynamics-nav/reports/BA Prod. Order Approval/50089/"/>
+  </ds:schemaRefs>
+</ds:datastoreItem>
 </file>
</xml_diff>

<commit_message>
Updated purch approval report layout.
</commit_message>
<xml_diff>
--- a/BryanA-DevelopmentsApp/Objects/ReportLayouts/ProdOrderApproval.docx
+++ b/BryanA-DevelopmentsApp/Objects/ReportLayouts/ProdOrderApproval.docx
@@ -118,10 +118,10 @@
         <w:tblStyle w:val="TableGrid"/>
         <w:tblW w:w="0" w:type="auto"/>
         <w:tblBorders>
-          <w:left w:val="none" w:color="auto" w:sz="0" w:space="0"/>
-          <w:right w:val="none" w:color="auto" w:sz="0" w:space="0"/>
-          <w:insideH w:val="none" w:color="auto" w:sz="0" w:space="0"/>
-          <w:insideV w:val="none" w:color="auto" w:sz="0" w:space="0"/>
+          <w:left w:val="none" w:sz="0" w:space="0" w:color="auto"/>
+          <w:right w:val="none" w:sz="0" w:space="0" w:color="auto"/>
+          <w:insideH w:val="none" w:sz="0" w:space="0" w:color="auto"/>
+          <w:insideV w:val="none" w:sz="0" w:space="0" w:color="auto"/>
         </w:tblBorders>
         <w:tblLook w:val="04A0" w:firstRow="1" w:lastRow="0" w:firstColumn="1" w:lastColumn="0" w:noHBand="0" w:noVBand="1"/>
       </w:tblPr>
@@ -266,6 +266,15 @@
                 <w:proofErr w:type="spellEnd"/>
               </w:sdtContent>
             </w:sdt>
+            <w:r>
+              <w:rPr>
+                <w:rFonts w:ascii="Calibri Light" w:hAnsi="Calibri Light" w:cs="Calibri Light"/>
+                <w:color w:val="0070C0"/>
+                <w:sz w:val="26"/>
+                <w:szCs w:val="26"/>
+              </w:rPr>
+              <w:t xml:space="preserve"> </w:t>
+            </w:r>
           </w:p>
         </w:tc>
       </w:tr>
@@ -362,14 +371,14 @@
                   <w:sz w:val="20"/>
                   <w:szCs w:val="20"/>
                 </w:rPr>
+                <w:alias w:val="#Nav: /SalesHeader/SourceType"/>
+                <w:tag w:val="#Nav: BA Prod. Order Approval/50089"/>
                 <w:id w:val="-1267845734"/>
                 <w:placeholder>
                   <w:docPart w:val="DefaultPlaceholder_-1854013440"/>
                 </w:placeholder>
                 <w:dataBinding w:prefixMappings="xmlns:ns0='urn:microsoft-dynamics-nav/reports/BA Prod. Order Approval/50089/'" w:xpath="/ns0:NavWordReportXmlPart[1]/ns0:SalesHeader[1]/ns0:SourceType[1]" w:storeItemID="{6EC095DC-DB5B-4B04-9780-E01BA8F3649F}"/>
                 <w:text/>
-                <w:alias w:val="#Nav: /SalesHeader/SourceType"/>
-                <w:tag w:val="#Nav: BA Prod. Order Approval/50089"/>
               </w:sdtPr>
               <w:sdtContent>
                 <w:proofErr w:type="spellStart"/>
@@ -1349,10 +1358,12 @@
     <w:rsid w:val="00C033A8"/>
     <w:rsid w:val="00C160C7"/>
     <w:rsid w:val="00CB6CB7"/>
+    <w:rsid w:val="00D05DEA"/>
     <w:rsid w:val="00D92400"/>
     <w:rsid w:val="00DF29AF"/>
     <w:rsid w:val="00E26F24"/>
     <w:rsid w:val="00E76C24"/>
+    <w:rsid w:val="00ED68A9"/>
     <w:rsid w:val="00F6449C"/>
     <w:rsid w:val="00F80351"/>
     <w:rsid w:val="00FA48B4"/>

</xml_diff>